<commit_message>
Updated PDF and Word Docs
</commit_message>
<xml_diff>
--- a/files/Zane-Resume.docx
+++ b/files/Zane-Resume.docx
@@ -14,40 +14,19 @@
       <w:r>
         <w:rPr>
           <w:b/>
-          <w:sz w:val="32"/>
-        </w:rPr>
-        <w:t>Resume for</w:t>
-      </w:r>
-      <w:r>
-        <w:rPr>
-          <w:b/>
-          <w:sz w:val="32"/>
-        </w:rPr>
-        <w:t xml:space="preserve"> </w:t>
-      </w:r>
-      <w:r>
-        <w:rPr>
-          <w:b/>
-          <w:sz w:val="32"/>
-        </w:rPr>
-        <w:t>Glendon Zane</w:t>
-      </w:r>
-      <w:r>
-        <w:rPr>
-          <w:b/>
           <w:noProof/>
           <w:sz w:val="32"/>
         </w:rPr>
         <w:drawing>
-          <wp:anchor distT="0" distB="0" distL="114300" distR="114300" simplePos="0" relativeHeight="251658752" behindDoc="0" locked="0" layoutInCell="1" allowOverlap="1" wp14:anchorId="38D881E0" wp14:editId="67F1EB8D">
+          <wp:anchor distT="0" distB="0" distL="114300" distR="114300" simplePos="0" relativeHeight="251658752" behindDoc="0" locked="0" layoutInCell="1" allowOverlap="1" wp14:anchorId="38D881E0" wp14:editId="7DD82215">
             <wp:simplePos x="0" y="0"/>
             <wp:positionH relativeFrom="margin">
-              <wp:align>right</wp:align>
+              <wp:posOffset>5674995</wp:posOffset>
             </wp:positionH>
             <wp:positionV relativeFrom="margin">
-              <wp:align>top</wp:align>
+              <wp:posOffset>9525</wp:posOffset>
             </wp:positionV>
-            <wp:extent cx="1371600" cy="1371600"/>
+            <wp:extent cx="914400" cy="914400"/>
             <wp:effectExtent l="0" t="0" r="0" b="0"/>
             <wp:wrapNone/>
             <wp:docPr id="2032420914" name="Picture 1"/>
@@ -70,7 +49,7 @@
                   <pic:spPr>
                     <a:xfrm>
                       <a:off x="0" y="0"/>
-                      <a:ext cx="1371600" cy="1371600"/>
+                      <a:ext cx="914400" cy="914400"/>
                     </a:xfrm>
                     <a:prstGeom prst="rect">
                       <a:avLst/>
@@ -87,6 +66,27 @@
             </wp14:sizeRelV>
           </wp:anchor>
         </w:drawing>
+      </w:r>
+      <w:r>
+        <w:rPr>
+          <w:b/>
+          <w:sz w:val="32"/>
+        </w:rPr>
+        <w:t>Resume for</w:t>
+      </w:r>
+      <w:r>
+        <w:rPr>
+          <w:b/>
+          <w:sz w:val="32"/>
+        </w:rPr>
+        <w:t xml:space="preserve"> </w:t>
+      </w:r>
+      <w:r>
+        <w:rPr>
+          <w:b/>
+          <w:sz w:val="32"/>
+        </w:rPr>
+        <w:t>Glendon Zane</w:t>
       </w:r>
       <w:r>
         <w:t xml:space="preserve"> </w:t>

</xml_diff>